<commit_message>
Cambio en documento de evidencias
</commit_message>
<xml_diff>
--- a/portal-academico/Evidencias Taller CSS3.docx
+++ b/portal-academico/Evidencias Taller CSS3.docx
@@ -3,23 +3,66 @@
 <w:document xmlns:wpc="http://schemas.microsoft.com/office/word/2010/wordprocessingCanvas" xmlns:cx="http://schemas.microsoft.com/office/drawing/2014/chartex" xmlns:cx1="http://schemas.microsoft.com/office/drawing/2015/9/8/chartex" xmlns:cx2="http://schemas.microsoft.com/office/drawing/2015/10/21/chartex" xmlns:cx3="http://schemas.microsoft.com/office/drawing/2016/5/9/chartex" xmlns:cx4="http://schemas.microsoft.com/office/drawing/2016/5/10/chartex" xmlns:cx5="http://schemas.microsoft.com/office/drawing/2016/5/11/chartex" xmlns:cx6="http://schemas.microsoft.com/office/drawing/2016/5/12/chartex" xmlns:cx7="http://schemas.microsoft.com/office/drawing/2016/5/13/chartex" xmlns:cx8="http://schemas.microsoft.com/office/drawing/2016/5/14/chartex" xmlns:mc="http://schemas.openxmlformats.org/markup-compatibility/2006" xmlns:aink="http://schemas.microsoft.com/office/drawing/2016/ink" xmlns:am3d="http://schemas.microsoft.com/office/drawing/2017/model3d" xmlns:o="urn:schemas-microsoft-com:office:office" xmlns:oel="http://schemas.microsoft.com/office/2019/extlst" xmlns:r="http://schemas.openxmlformats.org/officeDocument/2006/relationships" xmlns:m="http://schemas.openxmlformats.org/officeDocument/2006/math" xmlns:v="urn:schemas-microsoft-com:vml" xmlns:wp14="http://schemas.microsoft.com/office/word/2010/wordprocessingDrawing" xmlns:wp="http://schemas.openxmlformats.org/drawingml/2006/wordprocessingDrawing" xmlns:w10="urn:schemas-microsoft-com:office:word" xmlns:w="http://schemas.openxmlformats.org/wordprocessingml/2006/main" xmlns:w14="http://schemas.microsoft.com/office/word/2010/wordml" xmlns:w15="http://schemas.microsoft.com/office/word/2012/wordml" xmlns:w16cex="http://schemas.microsoft.com/office/word/2018/wordml/cex" xmlns:w16cid="http://schemas.microsoft.com/office/word/2016/wordml/cid" xmlns:w16="http://schemas.microsoft.com/office/word/2018/wordml" xmlns:w16du="http://schemas.microsoft.com/office/word/2023/wordml/word16du" xmlns:w16sdtdh="http://schemas.microsoft.com/office/word/2020/wordml/sdtdatahash" xmlns:w16sdtfl="http://schemas.microsoft.com/office/word/2024/wordml/sdtformatlock" xmlns:w16se="http://schemas.microsoft.com/office/word/2015/wordml/symex" xmlns:wpg="http://schemas.microsoft.com/office/word/2010/wordprocessingGroup" xmlns:wpi="http://schemas.microsoft.com/office/word/2010/wordprocessingInk" xmlns:wne="http://schemas.microsoft.com/office/word/2006/wordml" xmlns:wps="http://schemas.microsoft.com/office/word/2010/wordprocessingShape" mc:Ignorable="w14 w15 w16se w16cid w16 w16cex w16sdtdh w16sdtfl w16du wp14">
   <w:body>
     <w:p>
+      <w:pPr>
+        <w:jc w:val="center"/>
+        <w:rPr>
+          <w:sz w:val="36"/>
+          <w:szCs w:val="36"/>
+        </w:rPr>
+      </w:pPr>
       <w:r>
+        <w:rPr>
+          <w:sz w:val="36"/>
+          <w:szCs w:val="36"/>
+        </w:rPr>
         <w:t>Evidencias Taller CSS3</w:t>
       </w:r>
     </w:p>
     <w:p>
+      <w:pPr>
+        <w:jc w:val="center"/>
+        <w:rPr>
+          <w:sz w:val="36"/>
+          <w:szCs w:val="36"/>
+        </w:rPr>
+      </w:pPr>
       <w:r>
+        <w:rPr>
+          <w:sz w:val="36"/>
+          <w:szCs w:val="36"/>
+        </w:rPr>
         <w:t>Programación Web</w:t>
       </w:r>
     </w:p>
     <w:p>
+      <w:pPr>
+        <w:jc w:val="center"/>
+        <w:rPr>
+          <w:sz w:val="36"/>
+          <w:szCs w:val="36"/>
+        </w:rPr>
+      </w:pPr>
       <w:r>
+        <w:rPr>
+          <w:sz w:val="36"/>
+          <w:szCs w:val="36"/>
+        </w:rPr>
         <w:t>Maria Paulina Paez Guzman</w:t>
       </w:r>
     </w:p>
     <w:p/>
     <w:p>
+      <w:pPr>
+        <w:rPr>
+          <w:b/>
+          <w:bCs/>
+        </w:rPr>
+      </w:pPr>
       <w:r>
+        <w:rPr>
+          <w:b/>
+          <w:bCs/>
+        </w:rPr>
         <w:t>Bloque 11</w:t>
       </w:r>
     </w:p>
@@ -30,6 +73,9 @@
     </w:p>
     <w:p>
       <w:r>
+        <w:rPr>
+          <w:noProof/>
+        </w:rPr>
         <w:drawing>
           <wp:inline distT="0" distB="0" distL="0" distR="0" wp14:anchorId="647B8D64" wp14:editId="1B137200">
             <wp:extent cx="5612130" cy="1640205"/>
@@ -46,7 +92,7 @@
                     <pic:cNvPicPr/>
                   </pic:nvPicPr>
                   <pic:blipFill>
-                    <a:blip r:embed="rId4"/>
+                    <a:blip r:embed="rId5"/>
                     <a:stretch>
                       <a:fillRect/>
                     </a:stretch>
@@ -75,10 +121,13 @@
     </w:p>
     <w:p>
       <w:r>
+        <w:rPr>
+          <w:noProof/>
+        </w:rPr>
         <w:drawing>
-          <wp:inline distT="0" distB="0" distL="0" distR="0" wp14:anchorId="28D85C39" wp14:editId="5C253D41">
-            <wp:extent cx="3325587" cy="3796645"/>
-            <wp:effectExtent l="0" t="0" r="8255" b="0"/>
+          <wp:inline distT="0" distB="0" distL="0" distR="0" wp14:anchorId="28D85C39" wp14:editId="16FE8268">
+            <wp:extent cx="3020248" cy="3448056"/>
+            <wp:effectExtent l="0" t="0" r="8890" b="0"/>
             <wp:docPr id="2069251350" name="Imagen 1"/>
             <wp:cNvGraphicFramePr>
               <a:graphicFrameLocks xmlns:a="http://schemas.openxmlformats.org/drawingml/2006/main" noChangeAspect="1"/>
@@ -91,7 +140,7 @@
                     <pic:cNvPicPr/>
                   </pic:nvPicPr>
                   <pic:blipFill>
-                    <a:blip r:embed="rId5"/>
+                    <a:blip r:embed="rId6"/>
                     <a:stretch>
                       <a:fillRect/>
                     </a:stretch>
@@ -99,7 +148,7 @@
                   <pic:spPr>
                     <a:xfrm>
                       <a:off x="0" y="0"/>
-                      <a:ext cx="3336337" cy="3808918"/>
+                      <a:ext cx="3034753" cy="3464615"/>
                     </a:xfrm>
                     <a:prstGeom prst="rect">
                       <a:avLst/>
@@ -113,10 +162,11 @@
       </w:r>
     </w:p>
     <w:p/>
-    <w:p/>
-    <w:p/>
     <w:p>
       <w:r>
+        <w:rPr>
+          <w:noProof/>
+        </w:rPr>
         <w:drawing>
           <wp:inline distT="0" distB="0" distL="0" distR="0" wp14:anchorId="7A023B46" wp14:editId="3BEEF470">
             <wp:extent cx="3296921" cy="3771900"/>
@@ -133,7 +183,7 @@
                     <pic:cNvPicPr/>
                   </pic:nvPicPr>
                   <pic:blipFill>
-                    <a:blip r:embed="rId6"/>
+                    <a:blip r:embed="rId7"/>
                     <a:stretch>
                       <a:fillRect/>
                     </a:stretch>
@@ -159,7 +209,180 @@
         <w:t>Paso 3. Capturas</w:t>
       </w:r>
     </w:p>
-    <w:p/>
+    <w:p>
+      <w:r>
+        <w:rPr>
+          <w:noProof/>
+        </w:rPr>
+        <w:drawing>
+          <wp:inline distT="0" distB="0" distL="0" distR="0" wp14:anchorId="2F6E21DE" wp14:editId="22550B2B">
+            <wp:extent cx="2379345" cy="2643408"/>
+            <wp:effectExtent l="0" t="0" r="1905" b="5080"/>
+            <wp:docPr id="997241317" name="Imagen 1"/>
+            <wp:cNvGraphicFramePr>
+              <a:graphicFrameLocks xmlns:a="http://schemas.openxmlformats.org/drawingml/2006/main" noChangeAspect="1"/>
+            </wp:cNvGraphicFramePr>
+            <a:graphic xmlns:a="http://schemas.openxmlformats.org/drawingml/2006/main">
+              <a:graphicData uri="http://schemas.openxmlformats.org/drawingml/2006/picture">
+                <pic:pic xmlns:pic="http://schemas.openxmlformats.org/drawingml/2006/picture">
+                  <pic:nvPicPr>
+                    <pic:cNvPr id="997241317" name=""/>
+                    <pic:cNvPicPr/>
+                  </pic:nvPicPr>
+                  <pic:blipFill>
+                    <a:blip r:embed="rId8"/>
+                    <a:stretch>
+                      <a:fillRect/>
+                    </a:stretch>
+                  </pic:blipFill>
+                  <pic:spPr>
+                    <a:xfrm>
+                      <a:off x="0" y="0"/>
+                      <a:ext cx="2387848" cy="2652855"/>
+                    </a:xfrm>
+                    <a:prstGeom prst="rect">
+                      <a:avLst/>
+                    </a:prstGeom>
+                  </pic:spPr>
+                </pic:pic>
+              </a:graphicData>
+            </a:graphic>
+          </wp:inline>
+        </w:drawing>
+      </w:r>
+    </w:p>
+    <w:p>
+      <w:r>
+        <w:rPr>
+          <w:noProof/>
+        </w:rPr>
+        <w:lastRenderedPageBreak/>
+        <w:drawing>
+          <wp:inline distT="0" distB="0" distL="0" distR="0" wp14:anchorId="05470DB0" wp14:editId="1A30A28F">
+            <wp:extent cx="3054350" cy="2456819"/>
+            <wp:effectExtent l="0" t="0" r="0" b="635"/>
+            <wp:docPr id="2121855408" name="Imagen 1"/>
+            <wp:cNvGraphicFramePr>
+              <a:graphicFrameLocks xmlns:a="http://schemas.openxmlformats.org/drawingml/2006/main" noChangeAspect="1"/>
+            </wp:cNvGraphicFramePr>
+            <a:graphic xmlns:a="http://schemas.openxmlformats.org/drawingml/2006/main">
+              <a:graphicData uri="http://schemas.openxmlformats.org/drawingml/2006/picture">
+                <pic:pic xmlns:pic="http://schemas.openxmlformats.org/drawingml/2006/picture">
+                  <pic:nvPicPr>
+                    <pic:cNvPr id="2121855408" name=""/>
+                    <pic:cNvPicPr/>
+                  </pic:nvPicPr>
+                  <pic:blipFill>
+                    <a:blip r:embed="rId9"/>
+                    <a:stretch>
+                      <a:fillRect/>
+                    </a:stretch>
+                  </pic:blipFill>
+                  <pic:spPr>
+                    <a:xfrm>
+                      <a:off x="0" y="0"/>
+                      <a:ext cx="3067079" cy="2467058"/>
+                    </a:xfrm>
+                    <a:prstGeom prst="rect">
+                      <a:avLst/>
+                    </a:prstGeom>
+                  </pic:spPr>
+                </pic:pic>
+              </a:graphicData>
+            </a:graphic>
+          </wp:inline>
+        </w:drawing>
+      </w:r>
+    </w:p>
+    <w:p>
+      <w:r>
+        <w:rPr>
+          <w:noProof/>
+        </w:rPr>
+        <w:drawing>
+          <wp:inline distT="0" distB="0" distL="0" distR="0" wp14:anchorId="251C63D7" wp14:editId="17FEF4B8">
+            <wp:extent cx="3771616" cy="2749550"/>
+            <wp:effectExtent l="0" t="0" r="635" b="0"/>
+            <wp:docPr id="2082579981" name="Imagen 1"/>
+            <wp:cNvGraphicFramePr>
+              <a:graphicFrameLocks xmlns:a="http://schemas.openxmlformats.org/drawingml/2006/main" noChangeAspect="1"/>
+            </wp:cNvGraphicFramePr>
+            <a:graphic xmlns:a="http://schemas.openxmlformats.org/drawingml/2006/main">
+              <a:graphicData uri="http://schemas.openxmlformats.org/drawingml/2006/picture">
+                <pic:pic xmlns:pic="http://schemas.openxmlformats.org/drawingml/2006/picture">
+                  <pic:nvPicPr>
+                    <pic:cNvPr id="2082579981" name=""/>
+                    <pic:cNvPicPr/>
+                  </pic:nvPicPr>
+                  <pic:blipFill>
+                    <a:blip r:embed="rId10"/>
+                    <a:stretch>
+                      <a:fillRect/>
+                    </a:stretch>
+                  </pic:blipFill>
+                  <pic:spPr>
+                    <a:xfrm>
+                      <a:off x="0" y="0"/>
+                      <a:ext cx="3777973" cy="2754184"/>
+                    </a:xfrm>
+                    <a:prstGeom prst="rect">
+                      <a:avLst/>
+                    </a:prstGeom>
+                  </pic:spPr>
+                </pic:pic>
+              </a:graphicData>
+            </a:graphic>
+          </wp:inline>
+        </w:drawing>
+      </w:r>
+    </w:p>
+    <w:p>
+      <w:r>
+        <w:t>Paso 4. Búsqueda</w:t>
+      </w:r>
+    </w:p>
+    <w:p>
+      <w:r>
+        <w:rPr>
+          <w:noProof/>
+        </w:rPr>
+        <w:drawing>
+          <wp:inline distT="0" distB="0" distL="0" distR="0" wp14:anchorId="02F82DE1" wp14:editId="2D31C382">
+            <wp:extent cx="3377211" cy="1727200"/>
+            <wp:effectExtent l="0" t="0" r="0" b="6350"/>
+            <wp:docPr id="363692848" name="Imagen 1"/>
+            <wp:cNvGraphicFramePr>
+              <a:graphicFrameLocks xmlns:a="http://schemas.openxmlformats.org/drawingml/2006/main" noChangeAspect="1"/>
+            </wp:cNvGraphicFramePr>
+            <a:graphic xmlns:a="http://schemas.openxmlformats.org/drawingml/2006/main">
+              <a:graphicData uri="http://schemas.openxmlformats.org/drawingml/2006/picture">
+                <pic:pic xmlns:pic="http://schemas.openxmlformats.org/drawingml/2006/picture">
+                  <pic:nvPicPr>
+                    <pic:cNvPr id="363692848" name=""/>
+                    <pic:cNvPicPr/>
+                  </pic:nvPicPr>
+                  <pic:blipFill>
+                    <a:blip r:embed="rId11"/>
+                    <a:stretch>
+                      <a:fillRect/>
+                    </a:stretch>
+                  </pic:blipFill>
+                  <pic:spPr>
+                    <a:xfrm>
+                      <a:off x="0" y="0"/>
+                      <a:ext cx="3381493" cy="1729390"/>
+                    </a:xfrm>
+                    <a:prstGeom prst="rect">
+                      <a:avLst/>
+                    </a:prstGeom>
+                  </pic:spPr>
+                </pic:pic>
+              </a:graphicData>
+            </a:graphic>
+          </wp:inline>
+        </w:drawing>
+      </w:r>
+    </w:p>
     <w:sectPr>
       <w:pgSz w:w="12240" w:h="15840"/>
       <w:pgMar w:top="1417" w:right="1701" w:bottom="1417" w:left="1701" w:header="708" w:footer="708" w:gutter="0"/>
@@ -1382,4 +1605,16 @@
     </a:ext>
   </a:extLst>
 </a:theme>
+</file>
+
+<file path=customXml/item1.xml><?xml version="1.0" encoding="utf-8"?>
+<b:Sources xmlns:b="http://schemas.openxmlformats.org/officeDocument/2006/bibliography" xmlns="http://schemas.openxmlformats.org/officeDocument/2006/bibliography" SelectedStyle="\APASixthEditionOfficeOnline.xsl" StyleName="APA" Version="6"/>
+</file>
+
+<file path=customXml/itemProps1.xml><?xml version="1.0" encoding="utf-8"?>
+<ds:datastoreItem xmlns:ds="http://schemas.openxmlformats.org/officeDocument/2006/customXml" ds:itemID="{2A38C525-9458-4DB3-86D1-8CEE53E5C3E0}">
+  <ds:schemaRefs>
+    <ds:schemaRef ds:uri="http://schemas.openxmlformats.org/officeDocument/2006/bibliography"/>
+  </ds:schemaRefs>
+</ds:datastoreItem>
 </file>
</xml_diff>